<commit_message>
correct operand order for push and pop
</commit_message>
<xml_diff>
--- a/docs/assets/ANNA_Card.docx
+++ b/docs/assets/ANNA_Card.docx
@@ -1,6 +1,6 @@
 
 <file path=word/document.xml><?xml version="1.0" encoding="utf-8"?>
-<w:document xmlns:wpc="http://schemas.microsoft.com/office/word/2010/wordprocessingCanvas" xmlns:cx="http://schemas.microsoft.com/office/drawing/2014/chartex" xmlns:cx1="http://schemas.microsoft.com/office/drawing/2015/9/8/chartex" xmlns:cx2="http://schemas.microsoft.com/office/drawing/2015/10/21/chartex" xmlns:cx3="http://schemas.microsoft.com/office/drawing/2016/5/9/chartex" xmlns:cx4="http://schemas.microsoft.com/office/drawing/2016/5/10/chartex" xmlns:cx5="http://schemas.microsoft.com/office/drawing/2016/5/11/chartex" xmlns:cx6="http://schemas.microsoft.com/office/drawing/2016/5/12/chartex" xmlns:cx7="http://schemas.microsoft.com/office/drawing/2016/5/13/chartex" xmlns:cx8="http://schemas.microsoft.com/office/drawing/2016/5/14/chartex" xmlns:mc="http://schemas.openxmlformats.org/markup-compatibility/2006" xmlns:aink="http://schemas.microsoft.com/office/drawing/2016/ink" xmlns:am3d="http://schemas.microsoft.com/office/drawing/2017/model3d" xmlns:o="urn:schemas-microsoft-com:office:office" xmlns:oel="http://schemas.microsoft.com/office/2019/extlst" xmlns:r="http://schemas.openxmlformats.org/officeDocument/2006/relationships" xmlns:m="http://schemas.openxmlformats.org/officeDocument/2006/math" xmlns:v="urn:schemas-microsoft-com:vml" xmlns:wp14="http://schemas.microsoft.com/office/word/2010/wordprocessingDrawing" xmlns:wp="http://schemas.openxmlformats.org/drawingml/2006/wordprocessingDrawing" xmlns:w10="urn:schemas-microsoft-com:office:word" xmlns:w="http://schemas.openxmlformats.org/wordprocessingml/2006/main" xmlns:w14="http://schemas.microsoft.com/office/word/2010/wordml" xmlns:w15="http://schemas.microsoft.com/office/word/2012/wordml" xmlns:w16cex="http://schemas.microsoft.com/office/word/2018/wordml/cex" xmlns:w16cid="http://schemas.microsoft.com/office/word/2016/wordml/cid" xmlns:w16="http://schemas.microsoft.com/office/word/2018/wordml" xmlns:w16du="http://schemas.microsoft.com/office/word/2023/wordml/word16du" xmlns:w16sdtdh="http://schemas.microsoft.com/office/word/2020/wordml/sdtdatahash" xmlns:w16se="http://schemas.microsoft.com/office/word/2015/wordml/symex" xmlns:wpg="http://schemas.microsoft.com/office/word/2010/wordprocessingGroup" xmlns:wpi="http://schemas.microsoft.com/office/word/2010/wordprocessingInk" xmlns:wne="http://schemas.microsoft.com/office/word/2006/wordml" xmlns:wps="http://schemas.microsoft.com/office/word/2010/wordprocessingShape" mc:Ignorable="w14 w15 w16se w16cid w16 w16cex w16sdtdh w16du wp14">
+<w:document xmlns:wpc="http://schemas.microsoft.com/office/word/2010/wordprocessingCanvas" xmlns:cx="http://schemas.microsoft.com/office/drawing/2014/chartex" xmlns:cx1="http://schemas.microsoft.com/office/drawing/2015/9/8/chartex" xmlns:cx2="http://schemas.microsoft.com/office/drawing/2015/10/21/chartex" xmlns:cx3="http://schemas.microsoft.com/office/drawing/2016/5/9/chartex" xmlns:cx4="http://schemas.microsoft.com/office/drawing/2016/5/10/chartex" xmlns:cx5="http://schemas.microsoft.com/office/drawing/2016/5/11/chartex" xmlns:cx6="http://schemas.microsoft.com/office/drawing/2016/5/12/chartex" xmlns:cx7="http://schemas.microsoft.com/office/drawing/2016/5/13/chartex" xmlns:cx8="http://schemas.microsoft.com/office/drawing/2016/5/14/chartex" xmlns:mc="http://schemas.openxmlformats.org/markup-compatibility/2006" xmlns:aink="http://schemas.microsoft.com/office/drawing/2016/ink" xmlns:am3d="http://schemas.microsoft.com/office/drawing/2017/model3d" xmlns:o="urn:schemas-microsoft-com:office:office" xmlns:oel="http://schemas.microsoft.com/office/2019/extlst" xmlns:r="http://schemas.openxmlformats.org/officeDocument/2006/relationships" xmlns:m="http://schemas.openxmlformats.org/officeDocument/2006/math" xmlns:v="urn:schemas-microsoft-com:vml" xmlns:wp14="http://schemas.microsoft.com/office/word/2010/wordprocessingDrawing" xmlns:wp="http://schemas.openxmlformats.org/drawingml/2006/wordprocessingDrawing" xmlns:w10="urn:schemas-microsoft-com:office:word" xmlns:w="http://schemas.openxmlformats.org/wordprocessingml/2006/main" xmlns:w14="http://schemas.microsoft.com/office/word/2010/wordml" xmlns:w15="http://schemas.microsoft.com/office/word/2012/wordml" xmlns:w16cex="http://schemas.microsoft.com/office/word/2018/wordml/cex" xmlns:w16cid="http://schemas.microsoft.com/office/word/2016/wordml/cid" xmlns:w16="http://schemas.microsoft.com/office/word/2018/wordml" xmlns:w16du="http://schemas.microsoft.com/office/word/2023/wordml/word16du" xmlns:w16sdtdh="http://schemas.microsoft.com/office/word/2020/wordml/sdtdatahash" xmlns:w16sdtfl="http://schemas.microsoft.com/office/word/2024/wordml/sdtformatlock" xmlns:w16se="http://schemas.microsoft.com/office/word/2015/wordml/symex" xmlns:wpg="http://schemas.microsoft.com/office/word/2010/wordprocessingGroup" xmlns:wpi="http://schemas.microsoft.com/office/word/2010/wordprocessingInk" xmlns:wne="http://schemas.microsoft.com/office/word/2006/wordml" xmlns:wps="http://schemas.microsoft.com/office/word/2010/wordprocessingShape" mc:Ignorable="w14 w15 w16se w16cid w16 w16cex w16sdtdh w16sdtfl w16du wp14">
   <w:body>
     <w:p>
       <w:pPr>
@@ -4673,19 +4673,29 @@
                 <w:i/>
               </w:rPr>
             </w:pPr>
-            <w:proofErr w:type="spellStart"/>
-            <w:r>
-              <w:rPr>
-                <w:i/>
-              </w:rPr>
-              <w:t>Rsp</w:t>
-            </w:r>
-            <w:proofErr w:type="spellEnd"/>
-            <w:r>
-              <w:rPr>
-                <w:i/>
-              </w:rPr>
-              <w:t xml:space="preserve"> Rs</w:t>
+            <w:r>
+              <w:rPr>
+                <w:i/>
+              </w:rPr>
+              <w:t>R</w:t>
+            </w:r>
+            <w:r>
+              <w:rPr>
+                <w:i/>
+              </w:rPr>
+              <w:t>d</w:t>
+            </w:r>
+            <w:r>
+              <w:rPr>
+                <w:i/>
+              </w:rPr>
+              <w:t xml:space="preserve"> </w:t>
+            </w:r>
+            <w:r>
+              <w:rPr>
+                <w:i/>
+              </w:rPr>
+              <w:t>Rs</w:t>
             </w:r>
             <w:r>
               <w:rPr>
@@ -4747,6 +4757,23 @@
                 <w:i/>
                 <w:iCs/>
               </w:rPr>
+              <w:t>R</w:t>
+            </w:r>
+            <w:r>
+              <w:rPr>
+                <w:i/>
+                <w:iCs/>
+              </w:rPr>
+              <w:t>d</w:t>
+            </w:r>
+            <w:r>
+              <w:t>) to M(</w:t>
+            </w:r>
+            <w:r>
+              <w:rPr>
+                <w:i/>
+                <w:iCs/>
+              </w:rPr>
               <w:t>Rs</w:t>
             </w:r>
             <w:r>
@@ -4758,31 +4785,46 @@
               <w:t>1</w:t>
             </w:r>
             <w:r>
-              <w:t>) to M(</w:t>
-            </w:r>
-            <w:proofErr w:type="spellStart"/>
+              <w:t>) and decrement R(</w:t>
+            </w:r>
             <w:r>
               <w:rPr>
                 <w:i/>
                 <w:iCs/>
               </w:rPr>
-              <w:t>Rsp</w:t>
-            </w:r>
-            <w:proofErr w:type="spellEnd"/>
-            <w:r>
-              <w:t>) and decrement R(</w:t>
-            </w:r>
-            <w:proofErr w:type="spellStart"/>
+              <w:t>Rs</w:t>
+            </w:r>
             <w:r>
               <w:rPr>
                 <w:i/>
                 <w:iCs/>
-              </w:rPr>
-              <w:t>Rsp</w:t>
-            </w:r>
-            <w:proofErr w:type="spellEnd"/>
+                <w:vertAlign w:val="subscript"/>
+              </w:rPr>
+              <w:t>1</w:t>
+            </w:r>
             <w:r>
               <w:t>).</w:t>
+            </w:r>
+            <w:r>
+              <w:t xml:space="preserve">  </w:t>
+            </w:r>
+            <w:r>
+              <w:rPr>
+                <w:i/>
+                <w:iCs/>
+              </w:rPr>
+              <w:t>Rs</w:t>
+            </w:r>
+            <w:r>
+              <w:rPr>
+                <w:i/>
+                <w:iCs/>
+                <w:vertAlign w:val="subscript"/>
+              </w:rPr>
+              <w:t>1</w:t>
+            </w:r>
+            <w:r>
+              <w:t xml:space="preserve"> serves as the SP.</w:t>
             </w:r>
           </w:p>
         </w:tc>
@@ -4854,19 +4896,36 @@
                 <w:i/>
               </w:rPr>
             </w:pPr>
-            <w:proofErr w:type="spellStart"/>
-            <w:r>
-              <w:rPr>
-                <w:i/>
-              </w:rPr>
-              <w:t>Rsp</w:t>
-            </w:r>
-            <w:proofErr w:type="spellEnd"/>
-            <w:r>
-              <w:rPr>
-                <w:i/>
-              </w:rPr>
-              <w:t xml:space="preserve"> Rd</w:t>
+            <w:r>
+              <w:rPr>
+                <w:i/>
+              </w:rPr>
+              <w:t>R</w:t>
+            </w:r>
+            <w:r>
+              <w:rPr>
+                <w:i/>
+              </w:rPr>
+              <w:t>d</w:t>
+            </w:r>
+            <w:r>
+              <w:rPr>
+                <w:i/>
+              </w:rPr>
+              <w:t xml:space="preserve"> </w:t>
+            </w:r>
+            <w:r>
+              <w:rPr>
+                <w:i/>
+              </w:rPr>
+              <w:t>Rs</w:t>
+            </w:r>
+            <w:r>
+              <w:rPr>
+                <w:i/>
+                <w:vertAlign w:val="subscript"/>
+              </w:rPr>
+              <w:t>1</w:t>
             </w:r>
           </w:p>
         </w:tc>
@@ -4916,46 +4975,81 @@
             <w:r>
               <w:t xml:space="preserve"> instructions to increment R(</w:t>
             </w:r>
+            <w:r>
+              <w:rPr>
+                <w:i/>
+                <w:iCs/>
+              </w:rPr>
+              <w:t>Rs</w:t>
+            </w:r>
+            <w:r>
+              <w:rPr>
+                <w:i/>
+                <w:iCs/>
+                <w:vertAlign w:val="subscript"/>
+              </w:rPr>
+              <w:t>1</w:t>
+            </w:r>
+            <w:r>
+              <w:t>) then pop M(</w:t>
+            </w:r>
             <w:proofErr w:type="spellStart"/>
             <w:r>
               <w:rPr>
                 <w:i/>
                 <w:iCs/>
               </w:rPr>
-              <w:t>Rsp</w:t>
+              <w:t>Rs</w:t>
+            </w:r>
+            <w:r>
+              <w:rPr>
+                <w:i/>
+                <w:iCs/>
+                <w:vertAlign w:val="subscript"/>
+              </w:rPr>
+              <w:t>1</w:t>
             </w:r>
             <w:proofErr w:type="spellEnd"/>
             <w:r>
-              <w:t>) then pop M(</w:t>
-            </w:r>
-            <w:proofErr w:type="spellStart"/>
+              <w:t>) to R(</w:t>
+            </w:r>
             <w:r>
               <w:rPr>
                 <w:i/>
                 <w:iCs/>
               </w:rPr>
-              <w:t>Rsp</w:t>
-            </w:r>
-            <w:proofErr w:type="spellEnd"/>
-            <w:r>
-              <w:t>) to R(</w:t>
+              <w:t>R</w:t>
             </w:r>
             <w:r>
               <w:rPr>
                 <w:i/>
                 <w:iCs/>
               </w:rPr>
-              <w:t>R</w:t>
+              <w:t>d</w:t>
+            </w:r>
+            <w:r>
+              <w:t>).</w:t>
+            </w:r>
+            <w:r>
+              <w:t xml:space="preserve">  </w:t>
             </w:r>
             <w:r>
               <w:rPr>
                 <w:i/>
                 <w:iCs/>
               </w:rPr>
-              <w:t>d</w:t>
-            </w:r>
-            <w:r>
-              <w:t>).</w:t>
+              <w:t>Rs</w:t>
+            </w:r>
+            <w:r>
+              <w:rPr>
+                <w:i/>
+                <w:iCs/>
+                <w:vertAlign w:val="subscript"/>
+              </w:rPr>
+              <w:t>1</w:t>
+            </w:r>
+            <w:r>
+              <w:t xml:space="preserve"> serves as the SP.</w:t>
             </w:r>
           </w:p>
         </w:tc>
@@ -8213,7 +8307,7 @@
 </file>
 
 <file path=word/endnotes.xml><?xml version="1.0" encoding="utf-8"?>
-<w:endnotes xmlns:wpc="http://schemas.microsoft.com/office/word/2010/wordprocessingCanvas" xmlns:cx="http://schemas.microsoft.com/office/drawing/2014/chartex" xmlns:cx1="http://schemas.microsoft.com/office/drawing/2015/9/8/chartex" xmlns:cx2="http://schemas.microsoft.com/office/drawing/2015/10/21/chartex" xmlns:cx3="http://schemas.microsoft.com/office/drawing/2016/5/9/chartex" xmlns:cx4="http://schemas.microsoft.com/office/drawing/2016/5/10/chartex" xmlns:cx5="http://schemas.microsoft.com/office/drawing/2016/5/11/chartex" xmlns:cx6="http://schemas.microsoft.com/office/drawing/2016/5/12/chartex" xmlns:cx7="http://schemas.microsoft.com/office/drawing/2016/5/13/chartex" xmlns:cx8="http://schemas.microsoft.com/office/drawing/2016/5/14/chartex" xmlns:mc="http://schemas.openxmlformats.org/markup-compatibility/2006" xmlns:aink="http://schemas.microsoft.com/office/drawing/2016/ink" xmlns:am3d="http://schemas.microsoft.com/office/drawing/2017/model3d" xmlns:o="urn:schemas-microsoft-com:office:office" xmlns:oel="http://schemas.microsoft.com/office/2019/extlst" xmlns:r="http://schemas.openxmlformats.org/officeDocument/2006/relationships" xmlns:m="http://schemas.openxmlformats.org/officeDocument/2006/math" xmlns:v="urn:schemas-microsoft-com:vml" xmlns:wp14="http://schemas.microsoft.com/office/word/2010/wordprocessingDrawing" xmlns:wp="http://schemas.openxmlformats.org/drawingml/2006/wordprocessingDrawing" xmlns:w10="urn:schemas-microsoft-com:office:word" xmlns:w="http://schemas.openxmlformats.org/wordprocessingml/2006/main" xmlns:w14="http://schemas.microsoft.com/office/word/2010/wordml" xmlns:w15="http://schemas.microsoft.com/office/word/2012/wordml" xmlns:w16cex="http://schemas.microsoft.com/office/word/2018/wordml/cex" xmlns:w16cid="http://schemas.microsoft.com/office/word/2016/wordml/cid" xmlns:w16="http://schemas.microsoft.com/office/word/2018/wordml" xmlns:w16du="http://schemas.microsoft.com/office/word/2023/wordml/word16du" xmlns:w16sdtdh="http://schemas.microsoft.com/office/word/2020/wordml/sdtdatahash" xmlns:w16se="http://schemas.microsoft.com/office/word/2015/wordml/symex" xmlns:wpg="http://schemas.microsoft.com/office/word/2010/wordprocessingGroup" xmlns:wpi="http://schemas.microsoft.com/office/word/2010/wordprocessingInk" xmlns:wne="http://schemas.microsoft.com/office/word/2006/wordml" xmlns:wps="http://schemas.microsoft.com/office/word/2010/wordprocessingShape" mc:Ignorable="w14 w15 w16se w16cid w16 w16cex w16sdtdh w16du wp14">
+<w:endnotes xmlns:wpc="http://schemas.microsoft.com/office/word/2010/wordprocessingCanvas" xmlns:cx="http://schemas.microsoft.com/office/drawing/2014/chartex" xmlns:cx1="http://schemas.microsoft.com/office/drawing/2015/9/8/chartex" xmlns:cx2="http://schemas.microsoft.com/office/drawing/2015/10/21/chartex" xmlns:cx3="http://schemas.microsoft.com/office/drawing/2016/5/9/chartex" xmlns:cx4="http://schemas.microsoft.com/office/drawing/2016/5/10/chartex" xmlns:cx5="http://schemas.microsoft.com/office/drawing/2016/5/11/chartex" xmlns:cx6="http://schemas.microsoft.com/office/drawing/2016/5/12/chartex" xmlns:cx7="http://schemas.microsoft.com/office/drawing/2016/5/13/chartex" xmlns:cx8="http://schemas.microsoft.com/office/drawing/2016/5/14/chartex" xmlns:mc="http://schemas.openxmlformats.org/markup-compatibility/2006" xmlns:aink="http://schemas.microsoft.com/office/drawing/2016/ink" xmlns:am3d="http://schemas.microsoft.com/office/drawing/2017/model3d" xmlns:o="urn:schemas-microsoft-com:office:office" xmlns:oel="http://schemas.microsoft.com/office/2019/extlst" xmlns:r="http://schemas.openxmlformats.org/officeDocument/2006/relationships" xmlns:m="http://schemas.openxmlformats.org/officeDocument/2006/math" xmlns:v="urn:schemas-microsoft-com:vml" xmlns:wp14="http://schemas.microsoft.com/office/word/2010/wordprocessingDrawing" xmlns:wp="http://schemas.openxmlformats.org/drawingml/2006/wordprocessingDrawing" xmlns:w10="urn:schemas-microsoft-com:office:word" xmlns:w="http://schemas.openxmlformats.org/wordprocessingml/2006/main" xmlns:w14="http://schemas.microsoft.com/office/word/2010/wordml" xmlns:w15="http://schemas.microsoft.com/office/word/2012/wordml" xmlns:w16cex="http://schemas.microsoft.com/office/word/2018/wordml/cex" xmlns:w16cid="http://schemas.microsoft.com/office/word/2016/wordml/cid" xmlns:w16="http://schemas.microsoft.com/office/word/2018/wordml" xmlns:w16du="http://schemas.microsoft.com/office/word/2023/wordml/word16du" xmlns:w16sdtdh="http://schemas.microsoft.com/office/word/2020/wordml/sdtdatahash" xmlns:w16sdtfl="http://schemas.microsoft.com/office/word/2024/wordml/sdtformatlock" xmlns:w16se="http://schemas.microsoft.com/office/word/2015/wordml/symex" xmlns:wpg="http://schemas.microsoft.com/office/word/2010/wordprocessingGroup" xmlns:wpi="http://schemas.microsoft.com/office/word/2010/wordprocessingInk" xmlns:wne="http://schemas.microsoft.com/office/word/2006/wordml" xmlns:wps="http://schemas.microsoft.com/office/word/2010/wordprocessingShape" mc:Ignorable="w14 w15 w16se w16cid w16 w16cex w16sdtdh w16sdtfl w16du wp14">
   <w:endnote w:type="separator" w:id="-1">
     <w:p>
       <w:pPr>
@@ -8238,7 +8332,7 @@
 </file>
 
 <file path=word/footer1.xml><?xml version="1.0" encoding="utf-8"?>
-<w:ftr xmlns:wpc="http://schemas.microsoft.com/office/word/2010/wordprocessingCanvas" xmlns:cx="http://schemas.microsoft.com/office/drawing/2014/chartex" xmlns:cx1="http://schemas.microsoft.com/office/drawing/2015/9/8/chartex" xmlns:cx2="http://schemas.microsoft.com/office/drawing/2015/10/21/chartex" xmlns:cx3="http://schemas.microsoft.com/office/drawing/2016/5/9/chartex" xmlns:cx4="http://schemas.microsoft.com/office/drawing/2016/5/10/chartex" xmlns:cx5="http://schemas.microsoft.com/office/drawing/2016/5/11/chartex" xmlns:cx6="http://schemas.microsoft.com/office/drawing/2016/5/12/chartex" xmlns:cx7="http://schemas.microsoft.com/office/drawing/2016/5/13/chartex" xmlns:cx8="http://schemas.microsoft.com/office/drawing/2016/5/14/chartex" xmlns:mc="http://schemas.openxmlformats.org/markup-compatibility/2006" xmlns:aink="http://schemas.microsoft.com/office/drawing/2016/ink" xmlns:am3d="http://schemas.microsoft.com/office/drawing/2017/model3d" xmlns:o="urn:schemas-microsoft-com:office:office" xmlns:oel="http://schemas.microsoft.com/office/2019/extlst" xmlns:r="http://schemas.openxmlformats.org/officeDocument/2006/relationships" xmlns:m="http://schemas.openxmlformats.org/officeDocument/2006/math" xmlns:v="urn:schemas-microsoft-com:vml" xmlns:wp14="http://schemas.microsoft.com/office/word/2010/wordprocessingDrawing" xmlns:wp="http://schemas.openxmlformats.org/drawingml/2006/wordprocessingDrawing" xmlns:w10="urn:schemas-microsoft-com:office:word" xmlns:w="http://schemas.openxmlformats.org/wordprocessingml/2006/main" xmlns:w14="http://schemas.microsoft.com/office/word/2010/wordml" xmlns:w15="http://schemas.microsoft.com/office/word/2012/wordml" xmlns:w16cex="http://schemas.microsoft.com/office/word/2018/wordml/cex" xmlns:w16cid="http://schemas.microsoft.com/office/word/2016/wordml/cid" xmlns:w16="http://schemas.microsoft.com/office/word/2018/wordml" xmlns:w16du="http://schemas.microsoft.com/office/word/2023/wordml/word16du" xmlns:w16sdtdh="http://schemas.microsoft.com/office/word/2020/wordml/sdtdatahash" xmlns:w16se="http://schemas.microsoft.com/office/word/2015/wordml/symex" xmlns:wpg="http://schemas.microsoft.com/office/word/2010/wordprocessingGroup" xmlns:wpi="http://schemas.microsoft.com/office/word/2010/wordprocessingInk" xmlns:wne="http://schemas.microsoft.com/office/word/2006/wordml" xmlns:wps="http://schemas.microsoft.com/office/word/2010/wordprocessingShape" mc:Ignorable="w14 w15 w16se w16cid w16 w16cex w16sdtdh w16du wp14">
+<w:ftr xmlns:wpc="http://schemas.microsoft.com/office/word/2010/wordprocessingCanvas" xmlns:cx="http://schemas.microsoft.com/office/drawing/2014/chartex" xmlns:cx1="http://schemas.microsoft.com/office/drawing/2015/9/8/chartex" xmlns:cx2="http://schemas.microsoft.com/office/drawing/2015/10/21/chartex" xmlns:cx3="http://schemas.microsoft.com/office/drawing/2016/5/9/chartex" xmlns:cx4="http://schemas.microsoft.com/office/drawing/2016/5/10/chartex" xmlns:cx5="http://schemas.microsoft.com/office/drawing/2016/5/11/chartex" xmlns:cx6="http://schemas.microsoft.com/office/drawing/2016/5/12/chartex" xmlns:cx7="http://schemas.microsoft.com/office/drawing/2016/5/13/chartex" xmlns:cx8="http://schemas.microsoft.com/office/drawing/2016/5/14/chartex" xmlns:mc="http://schemas.openxmlformats.org/markup-compatibility/2006" xmlns:aink="http://schemas.microsoft.com/office/drawing/2016/ink" xmlns:am3d="http://schemas.microsoft.com/office/drawing/2017/model3d" xmlns:o="urn:schemas-microsoft-com:office:office" xmlns:oel="http://schemas.microsoft.com/office/2019/extlst" xmlns:r="http://schemas.openxmlformats.org/officeDocument/2006/relationships" xmlns:m="http://schemas.openxmlformats.org/officeDocument/2006/math" xmlns:v="urn:schemas-microsoft-com:vml" xmlns:wp14="http://schemas.microsoft.com/office/word/2010/wordprocessingDrawing" xmlns:wp="http://schemas.openxmlformats.org/drawingml/2006/wordprocessingDrawing" xmlns:w10="urn:schemas-microsoft-com:office:word" xmlns:w="http://schemas.openxmlformats.org/wordprocessingml/2006/main" xmlns:w14="http://schemas.microsoft.com/office/word/2010/wordml" xmlns:w15="http://schemas.microsoft.com/office/word/2012/wordml" xmlns:w16cex="http://schemas.microsoft.com/office/word/2018/wordml/cex" xmlns:w16cid="http://schemas.microsoft.com/office/word/2016/wordml/cid" xmlns:w16="http://schemas.microsoft.com/office/word/2018/wordml" xmlns:w16du="http://schemas.microsoft.com/office/word/2023/wordml/word16du" xmlns:w16sdtdh="http://schemas.microsoft.com/office/word/2020/wordml/sdtdatahash" xmlns:w16sdtfl="http://schemas.microsoft.com/office/word/2024/wordml/sdtformatlock" xmlns:w16se="http://schemas.microsoft.com/office/word/2015/wordml/symex" xmlns:wpg="http://schemas.microsoft.com/office/word/2010/wordprocessingGroup" xmlns:wpi="http://schemas.microsoft.com/office/word/2010/wordprocessingInk" xmlns:wne="http://schemas.microsoft.com/office/word/2006/wordml" xmlns:wps="http://schemas.microsoft.com/office/word/2010/wordprocessingShape" mc:Ignorable="w14 w15 w16se w16cid w16 w16cex w16sdtdh w16sdtfl w16du wp14">
   <w:p>
     <w:pPr>
       <w:pStyle w:val="Footer"/>
@@ -8505,7 +8599,7 @@
 </file>
 
 <file path=word/footnotes.xml><?xml version="1.0" encoding="utf-8"?>
-<w:footnotes xmlns:wpc="http://schemas.microsoft.com/office/word/2010/wordprocessingCanvas" xmlns:cx="http://schemas.microsoft.com/office/drawing/2014/chartex" xmlns:cx1="http://schemas.microsoft.com/office/drawing/2015/9/8/chartex" xmlns:cx2="http://schemas.microsoft.com/office/drawing/2015/10/21/chartex" xmlns:cx3="http://schemas.microsoft.com/office/drawing/2016/5/9/chartex" xmlns:cx4="http://schemas.microsoft.com/office/drawing/2016/5/10/chartex" xmlns:cx5="http://schemas.microsoft.com/office/drawing/2016/5/11/chartex" xmlns:cx6="http://schemas.microsoft.com/office/drawing/2016/5/12/chartex" xmlns:cx7="http://schemas.microsoft.com/office/drawing/2016/5/13/chartex" xmlns:cx8="http://schemas.microsoft.com/office/drawing/2016/5/14/chartex" xmlns:mc="http://schemas.openxmlformats.org/markup-compatibility/2006" xmlns:aink="http://schemas.microsoft.com/office/drawing/2016/ink" xmlns:am3d="http://schemas.microsoft.com/office/drawing/2017/model3d" xmlns:o="urn:schemas-microsoft-com:office:office" xmlns:oel="http://schemas.microsoft.com/office/2019/extlst" xmlns:r="http://schemas.openxmlformats.org/officeDocument/2006/relationships" xmlns:m="http://schemas.openxmlformats.org/officeDocument/2006/math" xmlns:v="urn:schemas-microsoft-com:vml" xmlns:wp14="http://schemas.microsoft.com/office/word/2010/wordprocessingDrawing" xmlns:wp="http://schemas.openxmlformats.org/drawingml/2006/wordprocessingDrawing" xmlns:w10="urn:schemas-microsoft-com:office:word" xmlns:w="http://schemas.openxmlformats.org/wordprocessingml/2006/main" xmlns:w14="http://schemas.microsoft.com/office/word/2010/wordml" xmlns:w15="http://schemas.microsoft.com/office/word/2012/wordml" xmlns:w16cex="http://schemas.microsoft.com/office/word/2018/wordml/cex" xmlns:w16cid="http://schemas.microsoft.com/office/word/2016/wordml/cid" xmlns:w16="http://schemas.microsoft.com/office/word/2018/wordml" xmlns:w16du="http://schemas.microsoft.com/office/word/2023/wordml/word16du" xmlns:w16sdtdh="http://schemas.microsoft.com/office/word/2020/wordml/sdtdatahash" xmlns:w16se="http://schemas.microsoft.com/office/word/2015/wordml/symex" xmlns:wpg="http://schemas.microsoft.com/office/word/2010/wordprocessingGroup" xmlns:wpi="http://schemas.microsoft.com/office/word/2010/wordprocessingInk" xmlns:wne="http://schemas.microsoft.com/office/word/2006/wordml" xmlns:wps="http://schemas.microsoft.com/office/word/2010/wordprocessingShape" mc:Ignorable="w14 w15 w16se w16cid w16 w16cex w16sdtdh w16du wp14">
+<w:footnotes xmlns:wpc="http://schemas.microsoft.com/office/word/2010/wordprocessingCanvas" xmlns:cx="http://schemas.microsoft.com/office/drawing/2014/chartex" xmlns:cx1="http://schemas.microsoft.com/office/drawing/2015/9/8/chartex" xmlns:cx2="http://schemas.microsoft.com/office/drawing/2015/10/21/chartex" xmlns:cx3="http://schemas.microsoft.com/office/drawing/2016/5/9/chartex" xmlns:cx4="http://schemas.microsoft.com/office/drawing/2016/5/10/chartex" xmlns:cx5="http://schemas.microsoft.com/office/drawing/2016/5/11/chartex" xmlns:cx6="http://schemas.microsoft.com/office/drawing/2016/5/12/chartex" xmlns:cx7="http://schemas.microsoft.com/office/drawing/2016/5/13/chartex" xmlns:cx8="http://schemas.microsoft.com/office/drawing/2016/5/14/chartex" xmlns:mc="http://schemas.openxmlformats.org/markup-compatibility/2006" xmlns:aink="http://schemas.microsoft.com/office/drawing/2016/ink" xmlns:am3d="http://schemas.microsoft.com/office/drawing/2017/model3d" xmlns:o="urn:schemas-microsoft-com:office:office" xmlns:oel="http://schemas.microsoft.com/office/2019/extlst" xmlns:r="http://schemas.openxmlformats.org/officeDocument/2006/relationships" xmlns:m="http://schemas.openxmlformats.org/officeDocument/2006/math" xmlns:v="urn:schemas-microsoft-com:vml" xmlns:wp14="http://schemas.microsoft.com/office/word/2010/wordprocessingDrawing" xmlns:wp="http://schemas.openxmlformats.org/drawingml/2006/wordprocessingDrawing" xmlns:w10="urn:schemas-microsoft-com:office:word" xmlns:w="http://schemas.openxmlformats.org/wordprocessingml/2006/main" xmlns:w14="http://schemas.microsoft.com/office/word/2010/wordml" xmlns:w15="http://schemas.microsoft.com/office/word/2012/wordml" xmlns:w16cex="http://schemas.microsoft.com/office/word/2018/wordml/cex" xmlns:w16cid="http://schemas.microsoft.com/office/word/2016/wordml/cid" xmlns:w16="http://schemas.microsoft.com/office/word/2018/wordml" xmlns:w16du="http://schemas.microsoft.com/office/word/2023/wordml/word16du" xmlns:w16sdtdh="http://schemas.microsoft.com/office/word/2020/wordml/sdtdatahash" xmlns:w16sdtfl="http://schemas.microsoft.com/office/word/2024/wordml/sdtformatlock" xmlns:w16se="http://schemas.microsoft.com/office/word/2015/wordml/symex" xmlns:wpg="http://schemas.microsoft.com/office/word/2010/wordprocessingGroup" xmlns:wpi="http://schemas.microsoft.com/office/word/2010/wordprocessingInk" xmlns:wne="http://schemas.microsoft.com/office/word/2006/wordml" xmlns:wps="http://schemas.microsoft.com/office/word/2010/wordprocessingShape" mc:Ignorable="w14 w15 w16se w16cid w16 w16cex w16sdtdh w16sdtfl w16du wp14">
   <w:footnote w:type="separator" w:id="-1">
     <w:p>
       <w:pPr>
@@ -8530,7 +8624,7 @@
 </file>
 
 <file path=word/numbering.xml><?xml version="1.0" encoding="utf-8"?>
-<w:numbering xmlns:wpc="http://schemas.microsoft.com/office/word/2010/wordprocessingCanvas" xmlns:cx="http://schemas.microsoft.com/office/drawing/2014/chartex" xmlns:cx1="http://schemas.microsoft.com/office/drawing/2015/9/8/chartex" xmlns:cx2="http://schemas.microsoft.com/office/drawing/2015/10/21/chartex" xmlns:cx3="http://schemas.microsoft.com/office/drawing/2016/5/9/chartex" xmlns:cx4="http://schemas.microsoft.com/office/drawing/2016/5/10/chartex" xmlns:cx5="http://schemas.microsoft.com/office/drawing/2016/5/11/chartex" xmlns:cx6="http://schemas.microsoft.com/office/drawing/2016/5/12/chartex" xmlns:cx7="http://schemas.microsoft.com/office/drawing/2016/5/13/chartex" xmlns:cx8="http://schemas.microsoft.com/office/drawing/2016/5/14/chartex" xmlns:mc="http://schemas.openxmlformats.org/markup-compatibility/2006" xmlns:aink="http://schemas.microsoft.com/office/drawing/2016/ink" xmlns:am3d="http://schemas.microsoft.com/office/drawing/2017/model3d" xmlns:o="urn:schemas-microsoft-com:office:office" xmlns:oel="http://schemas.microsoft.com/office/2019/extlst" xmlns:r="http://schemas.openxmlformats.org/officeDocument/2006/relationships" xmlns:m="http://schemas.openxmlformats.org/officeDocument/2006/math" xmlns:v="urn:schemas-microsoft-com:vml" xmlns:wp14="http://schemas.microsoft.com/office/word/2010/wordprocessingDrawing" xmlns:wp="http://schemas.openxmlformats.org/drawingml/2006/wordprocessingDrawing" xmlns:w10="urn:schemas-microsoft-com:office:word" xmlns:w="http://schemas.openxmlformats.org/wordprocessingml/2006/main" xmlns:w14="http://schemas.microsoft.com/office/word/2010/wordml" xmlns:w15="http://schemas.microsoft.com/office/word/2012/wordml" xmlns:w16cex="http://schemas.microsoft.com/office/word/2018/wordml/cex" xmlns:w16cid="http://schemas.microsoft.com/office/word/2016/wordml/cid" xmlns:w16="http://schemas.microsoft.com/office/word/2018/wordml" xmlns:w16du="http://schemas.microsoft.com/office/word/2023/wordml/word16du" xmlns:w16sdtdh="http://schemas.microsoft.com/office/word/2020/wordml/sdtdatahash" xmlns:w16se="http://schemas.microsoft.com/office/word/2015/wordml/symex" xmlns:wpg="http://schemas.microsoft.com/office/word/2010/wordprocessingGroup" xmlns:wpi="http://schemas.microsoft.com/office/word/2010/wordprocessingInk" xmlns:wne="http://schemas.microsoft.com/office/word/2006/wordml" xmlns:wps="http://schemas.microsoft.com/office/word/2010/wordprocessingShape" mc:Ignorable="w14 w15 w16se w16cid w16 w16cex w16sdtdh w16du wp14">
+<w:numbering xmlns:wpc="http://schemas.microsoft.com/office/word/2010/wordprocessingCanvas" xmlns:cx="http://schemas.microsoft.com/office/drawing/2014/chartex" xmlns:cx1="http://schemas.microsoft.com/office/drawing/2015/9/8/chartex" xmlns:cx2="http://schemas.microsoft.com/office/drawing/2015/10/21/chartex" xmlns:cx3="http://schemas.microsoft.com/office/drawing/2016/5/9/chartex" xmlns:cx4="http://schemas.microsoft.com/office/drawing/2016/5/10/chartex" xmlns:cx5="http://schemas.microsoft.com/office/drawing/2016/5/11/chartex" xmlns:cx6="http://schemas.microsoft.com/office/drawing/2016/5/12/chartex" xmlns:cx7="http://schemas.microsoft.com/office/drawing/2016/5/13/chartex" xmlns:cx8="http://schemas.microsoft.com/office/drawing/2016/5/14/chartex" xmlns:mc="http://schemas.openxmlformats.org/markup-compatibility/2006" xmlns:aink="http://schemas.microsoft.com/office/drawing/2016/ink" xmlns:am3d="http://schemas.microsoft.com/office/drawing/2017/model3d" xmlns:o="urn:schemas-microsoft-com:office:office" xmlns:oel="http://schemas.microsoft.com/office/2019/extlst" xmlns:r="http://schemas.openxmlformats.org/officeDocument/2006/relationships" xmlns:m="http://schemas.openxmlformats.org/officeDocument/2006/math" xmlns:v="urn:schemas-microsoft-com:vml" xmlns:wp14="http://schemas.microsoft.com/office/word/2010/wordprocessingDrawing" xmlns:wp="http://schemas.openxmlformats.org/drawingml/2006/wordprocessingDrawing" xmlns:w10="urn:schemas-microsoft-com:office:word" xmlns:w="http://schemas.openxmlformats.org/wordprocessingml/2006/main" xmlns:w14="http://schemas.microsoft.com/office/word/2010/wordml" xmlns:w15="http://schemas.microsoft.com/office/word/2012/wordml" xmlns:w16cex="http://schemas.microsoft.com/office/word/2018/wordml/cex" xmlns:w16cid="http://schemas.microsoft.com/office/word/2016/wordml/cid" xmlns:w16="http://schemas.microsoft.com/office/word/2018/wordml" xmlns:w16du="http://schemas.microsoft.com/office/word/2023/wordml/word16du" xmlns:w16sdtdh="http://schemas.microsoft.com/office/word/2020/wordml/sdtdatahash" xmlns:w16sdtfl="http://schemas.microsoft.com/office/word/2024/wordml/sdtformatlock" xmlns:w16se="http://schemas.microsoft.com/office/word/2015/wordml/symex" xmlns:wpg="http://schemas.microsoft.com/office/word/2010/wordprocessingGroup" xmlns:wpi="http://schemas.microsoft.com/office/word/2010/wordprocessingInk" xmlns:wne="http://schemas.microsoft.com/office/word/2006/wordml" xmlns:wps="http://schemas.microsoft.com/office/word/2010/wordprocessingShape" mc:Ignorable="w14 w15 w16se w16cid w16 w16cex w16sdtdh w16sdtfl w16du wp14">
   <w:abstractNum w:abstractNumId="0" w15:restartNumberingAfterBreak="0">
     <w:nsid w:val="098D1E6E"/>
     <w:multiLevelType w:val="hybridMultilevel"/>
@@ -9610,7 +9704,7 @@
 </file>
 
 <file path=word/styles.xml><?xml version="1.0" encoding="utf-8"?>
-<w:styles xmlns:mc="http://schemas.openxmlformats.org/markup-compatibility/2006" xmlns:r="http://schemas.openxmlformats.org/officeDocument/2006/relationships" xmlns:w="http://schemas.openxmlformats.org/wordprocessingml/2006/main" xmlns:w14="http://schemas.microsoft.com/office/word/2010/wordml" xmlns:w15="http://schemas.microsoft.com/office/word/2012/wordml" xmlns:w16cex="http://schemas.microsoft.com/office/word/2018/wordml/cex" xmlns:w16cid="http://schemas.microsoft.com/office/word/2016/wordml/cid" xmlns:w16="http://schemas.microsoft.com/office/word/2018/wordml" xmlns:w16du="http://schemas.microsoft.com/office/word/2023/wordml/word16du" xmlns:w16sdtdh="http://schemas.microsoft.com/office/word/2020/wordml/sdtdatahash" xmlns:w16se="http://schemas.microsoft.com/office/word/2015/wordml/symex" mc:Ignorable="w14 w15 w16se w16cid w16 w16cex w16sdtdh w16du">
+<w:styles xmlns:mc="http://schemas.openxmlformats.org/markup-compatibility/2006" xmlns:r="http://schemas.openxmlformats.org/officeDocument/2006/relationships" xmlns:w="http://schemas.openxmlformats.org/wordprocessingml/2006/main" xmlns:w14="http://schemas.microsoft.com/office/word/2010/wordml" xmlns:w15="http://schemas.microsoft.com/office/word/2012/wordml" xmlns:w16cex="http://schemas.microsoft.com/office/word/2018/wordml/cex" xmlns:w16cid="http://schemas.microsoft.com/office/word/2016/wordml/cid" xmlns:w16="http://schemas.microsoft.com/office/word/2018/wordml" xmlns:w16du="http://schemas.microsoft.com/office/word/2023/wordml/word16du" xmlns:w16sdtdh="http://schemas.microsoft.com/office/word/2020/wordml/sdtdatahash" xmlns:w16sdtfl="http://schemas.microsoft.com/office/word/2024/wordml/sdtformatlock" xmlns:w16se="http://schemas.microsoft.com/office/word/2015/wordml/symex" mc:Ignorable="w14 w15 w16se w16cid w16 w16cex w16sdtdh w16sdtfl w16du">
   <w:docDefaults>
     <w:rPrDefault>
       <w:rPr>
@@ -10041,7 +10135,6 @@
   <w:style w:type="character" w:default="1" w:styleId="DefaultParagraphFont">
     <w:name w:val="Default Paragraph Font"/>
     <w:uiPriority w:val="1"/>
-    <w:semiHidden/>
     <w:unhideWhenUsed/>
   </w:style>
   <w:style w:type="table" w:default="1" w:styleId="TableNormal">

</xml_diff>

<commit_message>
add outc to docs
</commit_message>
<xml_diff>
--- a/docs/assets/ANNA_Card.docx
+++ b/docs/assets/ANNA_Card.docx
@@ -2182,6 +2182,132 @@
         </w:tc>
       </w:tr>
       <w:tr>
+        <w:tc>
+          <w:tcPr>
+            <w:tcW w:w="984" w:type="dxa"/>
+            <w:tcBorders>
+              <w:top w:val="single" w:sz="4" w:space="0" w:color="000000"/>
+              <w:left w:val="single" w:sz="4" w:space="0" w:color="000000"/>
+              <w:bottom w:val="single" w:sz="4" w:space="0" w:color="000000"/>
+              <w:right w:val="single" w:sz="4" w:space="0" w:color="000000"/>
+            </w:tcBorders>
+            <w:vAlign w:val="center"/>
+          </w:tcPr>
+          <w:p>
+            <w:pPr>
+              <w:spacing w:after="0" w:line="259" w:lineRule="auto"/>
+              <w:ind w:left="58" w:firstLine="0"/>
+              <w:jc w:val="center"/>
+            </w:pPr>
+            <w:r>
+              <w:t>0011</w:t>
+            </w:r>
+          </w:p>
+        </w:tc>
+        <w:tc>
+          <w:tcPr>
+            <w:tcW w:w="1114" w:type="dxa"/>
+            <w:tcBorders>
+              <w:top w:val="single" w:sz="4" w:space="0" w:color="000000"/>
+              <w:left w:val="single" w:sz="4" w:space="0" w:color="000000"/>
+              <w:bottom w:val="single" w:sz="4" w:space="0" w:color="000000"/>
+              <w:right w:val="nil"/>
+            </w:tcBorders>
+            <w:vAlign w:val="center"/>
+          </w:tcPr>
+          <w:p>
+            <w:pPr>
+              <w:spacing w:after="0" w:line="259" w:lineRule="auto"/>
+              <w:ind w:left="0" w:firstLine="16"/>
+              <w:jc w:val="center"/>
+              <w:rPr>
+                <w:rFonts w:ascii="Courier New" w:eastAsia="Courier New" w:hAnsi="Courier New" w:cs="Courier New"/>
+              </w:rPr>
+            </w:pPr>
+            <w:proofErr w:type="spellStart"/>
+            <w:r>
+              <w:rPr>
+                <w:rFonts w:ascii="Courier New" w:eastAsia="Courier New" w:hAnsi="Courier New" w:cs="Courier New"/>
+              </w:rPr>
+              <w:t>out</w:t>
+            </w:r>
+            <w:r>
+              <w:rPr>
+                <w:rFonts w:ascii="Courier New" w:eastAsia="Courier New" w:hAnsi="Courier New" w:cs="Courier New"/>
+              </w:rPr>
+              <w:t>c</w:t>
+            </w:r>
+            <w:proofErr w:type="spellEnd"/>
+          </w:p>
+        </w:tc>
+        <w:tc>
+          <w:tcPr>
+            <w:tcW w:w="1433" w:type="dxa"/>
+            <w:tcBorders>
+              <w:top w:val="single" w:sz="4" w:space="0" w:color="000000"/>
+              <w:left w:val="nil"/>
+              <w:bottom w:val="single" w:sz="4" w:space="0" w:color="000000"/>
+              <w:right w:val="single" w:sz="4" w:space="0" w:color="000000"/>
+            </w:tcBorders>
+            <w:vAlign w:val="center"/>
+          </w:tcPr>
+          <w:p>
+            <w:pPr>
+              <w:spacing w:after="0" w:line="259" w:lineRule="auto"/>
+              <w:ind w:left="0" w:right="120" w:firstLine="0"/>
+              <w:jc w:val="center"/>
+              <w:rPr>
+                <w:i/>
+              </w:rPr>
+            </w:pPr>
+            <w:r>
+              <w:rPr>
+                <w:i/>
+              </w:rPr>
+              <w:t>Rd</w:t>
+            </w:r>
+          </w:p>
+        </w:tc>
+        <w:tc>
+          <w:tcPr>
+            <w:tcW w:w="6098" w:type="dxa"/>
+            <w:tcBorders>
+              <w:top w:val="single" w:sz="4" w:space="0" w:color="000000"/>
+              <w:left w:val="single" w:sz="4" w:space="0" w:color="000000"/>
+              <w:bottom w:val="single" w:sz="4" w:space="0" w:color="000000"/>
+              <w:right w:val="single" w:sz="4" w:space="0" w:color="000000"/>
+            </w:tcBorders>
+            <w:vAlign w:val="center"/>
+          </w:tcPr>
+          <w:p>
+            <w:pPr>
+              <w:spacing w:after="0" w:line="259" w:lineRule="auto"/>
+              <w:ind w:left="69" w:firstLine="0"/>
+              <w:jc w:val="center"/>
+            </w:pPr>
+            <w:r>
+              <w:t xml:space="preserve">Prints the </w:t>
+            </w:r>
+            <w:r>
+              <w:t>ASCII character</w:t>
+            </w:r>
+            <w:r>
+              <w:t xml:space="preserve"> at M[R(</w:t>
+            </w:r>
+            <w:r>
+              <w:rPr>
+                <w:i/>
+                <w:iCs/>
+              </w:rPr>
+              <w:t>Rd</w:t>
+            </w:r>
+            <w:r>
+              <w:t xml:space="preserve">)] to STDOUT. </w:t>
+            </w:r>
+          </w:p>
+        </w:tc>
+      </w:tr>
+      <w:tr>
         <w:trPr>
           <w:trHeight w:val="286"/>
         </w:trPr>
@@ -3235,6 +3361,7 @@
               <w:jc w:val="center"/>
             </w:pPr>
             <w:r>
+              <w:lastRenderedPageBreak/>
               <w:t xml:space="preserve">1011 </w:t>
             </w:r>
           </w:p>
@@ -3366,7 +3493,6 @@
               <w:jc w:val="center"/>
             </w:pPr>
             <w:r>
-              <w:lastRenderedPageBreak/>
               <w:t xml:space="preserve">1100 </w:t>
             </w:r>
           </w:p>
@@ -4677,25 +4803,7 @@
               <w:rPr>
                 <w:i/>
               </w:rPr>
-              <w:t>R</w:t>
-            </w:r>
-            <w:r>
-              <w:rPr>
-                <w:i/>
-              </w:rPr>
-              <w:t>d</w:t>
-            </w:r>
-            <w:r>
-              <w:rPr>
-                <w:i/>
-              </w:rPr>
-              <w:t xml:space="preserve"> </w:t>
-            </w:r>
-            <w:r>
-              <w:rPr>
-                <w:i/>
-              </w:rPr>
-              <w:t>Rs</w:t>
+              <w:t>Rd Rs</w:t>
             </w:r>
             <w:r>
               <w:rPr>
@@ -4803,10 +4911,7 @@
               <w:t>1</w:t>
             </w:r>
             <w:r>
-              <w:t>).</w:t>
-            </w:r>
-            <w:r>
-              <w:t xml:space="preserve">  </w:t>
+              <w:t xml:space="preserve">).  </w:t>
             </w:r>
             <w:r>
               <w:rPr>
@@ -4900,25 +5005,7 @@
               <w:rPr>
                 <w:i/>
               </w:rPr>
-              <w:t>R</w:t>
-            </w:r>
-            <w:r>
-              <w:rPr>
-                <w:i/>
-              </w:rPr>
-              <w:t>d</w:t>
-            </w:r>
-            <w:r>
-              <w:rPr>
-                <w:i/>
-              </w:rPr>
-              <w:t xml:space="preserve"> </w:t>
-            </w:r>
-            <w:r>
-              <w:rPr>
-                <w:i/>
-              </w:rPr>
-              <w:t>Rs</w:t>
+              <w:t>Rd Rs</w:t>
             </w:r>
             <w:r>
               <w:rPr>
@@ -4993,7 +5080,6 @@
             <w:r>
               <w:t>) then pop M(</w:t>
             </w:r>
-            <w:proofErr w:type="spellStart"/>
             <w:r>
               <w:rPr>
                 <w:i/>
@@ -5009,7 +5095,6 @@
               </w:rPr>
               <w:t>1</w:t>
             </w:r>
-            <w:proofErr w:type="spellEnd"/>
             <w:r>
               <w:t>) to R(</w:t>
             </w:r>
@@ -5028,10 +5113,7 @@
               <w:t>d</w:t>
             </w:r>
             <w:r>
-              <w:t>).</w:t>
-            </w:r>
-            <w:r>
-              <w:t xml:space="preserve">  </w:t>
+              <w:t xml:space="preserve">).  </w:t>
             </w:r>
             <w:r>
               <w:rPr>
@@ -5378,10 +5460,7 @@
               <w:jc w:val="center"/>
             </w:pPr>
             <w:r>
-              <w:t>Defines stack frames (activation records) for function.  See the ANNA</w:t>
-            </w:r>
-            <w:r>
-              <w:t xml:space="preserve"> Guide for more information.</w:t>
+              <w:t>Defines stack frames (activation records) for function.  See the ANNA Guide for more information.</w:t>
             </w:r>
           </w:p>
         </w:tc>
@@ -5573,10 +5652,7 @@
               <w:jc w:val="center"/>
             </w:pPr>
             <w:r>
-              <w:t>Sets the specified label to the value indicated.  Must specify a label with this directive.</w:t>
-            </w:r>
-            <w:r>
-              <w:t xml:space="preserve">  Similar </w:t>
+              <w:t xml:space="preserve">Sets the specified label to the value indicated.  Must specify a label with this directive.  Similar </w:t>
             </w:r>
             <w:proofErr w:type="gramStart"/>
             <w:r>
@@ -5873,6 +5949,7 @@
         <w:ind w:left="-5"/>
       </w:pPr>
       <w:r>
+        <w:lastRenderedPageBreak/>
         <w:t xml:space="preserve">Registers </w:t>
       </w:r>
     </w:p>
@@ -5944,7 +6021,6 @@
         <w:ind w:hanging="360"/>
       </w:pPr>
       <w:r>
-        <w:lastRenderedPageBreak/>
         <w:t xml:space="preserve">A register can be any value from: </w:t>
       </w:r>
       <w:r>
@@ -7464,6 +7540,7 @@
               <w:ind w:left="101" w:right="101" w:firstLine="0"/>
             </w:pPr>
             <w:r>
+              <w:lastRenderedPageBreak/>
               <w:t xml:space="preserve">15 </w:t>
             </w:r>
             <w:r>
@@ -7639,7 +7716,6 @@
               <w:ind w:left="108" w:firstLine="0"/>
             </w:pPr>
             <w:r>
-              <w:lastRenderedPageBreak/>
               <w:t xml:space="preserve">Opcode </w:t>
             </w:r>
           </w:p>
@@ -10135,6 +10211,7 @@
   <w:style w:type="character" w:default="1" w:styleId="DefaultParagraphFont">
     <w:name w:val="Default Paragraph Font"/>
     <w:uiPriority w:val="1"/>
+    <w:semiHidden/>
     <w:unhideWhenUsed/>
   </w:style>
   <w:style w:type="table" w:default="1" w:styleId="TableNormal">

</xml_diff>